<commit_message>
Ajout de la matrice RACI à la politique et précision du rôle Accountable dans le plan
</commit_message>
<xml_diff>
--- a/1_Spotify_Data_Governance/versions_docx_ppt/2_Politique_Gouvernance_Donnees.docx
+++ b/1_Spotify_Data_Governance/versions_docx_ppt/2_Politique_Gouvernance_Donnees.docx
@@ -225,25 +225,7 @@
           <w:sz w:val="22"/>
           <w:szCs w:val="22"/>
         </w:rPr>
-        <w:t xml:space="preserve">Responsabilité (accountability). Chaque jeu de données </w:t>
-      </w:r>
-      <w:proofErr w:type="gramStart"/>
-      <w:r>
-        <w:rPr>
-          <w:color w:val="000000"/>
-          <w:sz w:val="22"/>
-          <w:szCs w:val="22"/>
-        </w:rPr>
-        <w:t>a</w:t>
-      </w:r>
-      <w:proofErr w:type="gramEnd"/>
-      <w:r>
-        <w:rPr>
-          <w:color w:val="000000"/>
-          <w:sz w:val="22"/>
-          <w:szCs w:val="22"/>
-        </w:rPr>
-        <w:t xml:space="preserve"> un responsable identifié. Des gestionnaires de données (data stewards) et un délégué à la protection des données (data protection officer, DPO) garantissent le respect des normes organisationnelles, éthiques et légales.</w:t>
+        <w:t xml:space="preserve">Responsabilité (accountability). Chaque jeu de données a un responsable identifié. Des gestionnaires de données (data stewards) et un délégué à la protection des données (data protection officer, DPO) garantissent le respect des normes organisationnelles, éthiques et légales.</w:t>
       </w:r>
     </w:p>
     <w:p>
@@ -525,6 +507,7 @@
     </w:p>
     <w:p>
       <w:pPr>
+        <w:keepNext/>
         <w:spacing w:after="120" w:line="276" w:lineRule="auto"/>
         <w:jc w:val="both"/>
       </w:pPr>
@@ -534,7 +517,1826 @@
           <w:sz w:val="22"/>
           <w:szCs w:val="22"/>
         </w:rPr>
-        <w:t>L'attribution des responsabilités suit la logique de la matrice RACI : pour chaque activité liée aux données, une seule personne répond du résultat et tranche. Le détail de cette organisation figure dans l'organigramme des rôles annexé à la présente politique.</w:t>
+        <w:t>L'attribution des responsabilités suit la matrice RACI ci-dessous : pour chaque activité liée aux données, plusieurs acteurs peuvent réaliser le travail (R), mais une seule personne en répond et tranche (A). La place de chaque rôle dans l'organisation figure dans l'organigramme annexé à la présente politique.</w:t>
+      </w:r>
+    </w:p>
+    <w:tbl>
+      <w:tblPr>
+        <w:tblW w:w="9638" w:type="dxa"/>
+        <w:jc w:val="center"/>
+        <w:tblBorders>
+          <w:top w:val="single" w:sz="4" w:space="0" w:color="B8C9E0"/>
+          <w:left w:val="nil"/>
+          <w:bottom w:val="single" w:sz="4" w:space="0" w:color="B8C9E0"/>
+          <w:right w:val="nil"/>
+          <w:insideH w:val="single" w:sz="4" w:space="0" w:color="B8C9E0"/>
+          <w:insideV w:val="single" w:sz="4" w:space="0" w:color="B8C9E0"/>
+        </w:tblBorders>
+        <w:tblLayout w:type="fixed"/>
+        <w:tblCellMar>
+          <w:top w:w="45" w:type="dxa"/>
+          <w:left w:w="50" w:type="dxa"/>
+          <w:bottom w:w="45" w:type="dxa"/>
+          <w:right w:w="50" w:type="dxa"/>
+        </w:tblCellMar>
+        <w:tblLook w:val="04A0" w:firstRow="1" w:lastRow="0" w:firstColumn="1" w:lastColumn="0" w:noHBand="0" w:noVBand="1"/>
+      </w:tblPr>
+      <w:tblGrid>
+        <w:gridCol w:w="2246"/>
+        <w:gridCol w:w="924"/>
+        <w:gridCol w:w="924"/>
+        <w:gridCol w:w="924"/>
+        <w:gridCol w:w="924"/>
+        <w:gridCol w:w="924"/>
+        <w:gridCol w:w="924"/>
+        <w:gridCol w:w="924"/>
+        <w:gridCol w:w="924"/>
+      </w:tblGrid>
+      <w:tr>
+        <w:trPr>
+          <w:cantSplit/>
+          <w:tblHeader/>
+        </w:trPr>
+        <w:tc>
+          <w:tcPr>
+            <w:tcW w:w="2246" w:type="dxa"/>
+            <w:shd w:val="clear" w:color="auto" w:fill="1F3864"/>
+            <w:vAlign w:val="center"/>
+          </w:tcPr>
+          <w:p>
+            <w:pPr>
+              <w:keepNext/>
+              <w:spacing w:before="0" w:after="0" w:line="240" w:lineRule="auto"/>
+              <w:jc w:val="left"/>
+            </w:pPr>
+            <w:r>
+              <w:rPr>
+                <w:rFonts w:ascii="Calibri" w:cs="Calibri" w:eastAsia="Calibri" w:hAnsi="Calibri"/>
+                <w:b/>
+                <w:bCs/>
+                <w:color w:val="FFFFFF"/>
+                <w:sz w:val="16"/>
+                <w:szCs w:val="16"/>
+              </w:rPr>
+              <w:t xml:space="preserve">Activité</w:t>
+            </w:r>
+          </w:p>
+        </w:tc>
+        <w:tc>
+          <w:tcPr>
+            <w:tcW w:w="924" w:type="dxa"/>
+            <w:shd w:val="clear" w:color="auto" w:fill="1F3864"/>
+            <w:vAlign w:val="center"/>
+          </w:tcPr>
+          <w:p>
+            <w:pPr>
+              <w:keepNext/>
+              <w:spacing w:before="0" w:after="0" w:line="240" w:lineRule="auto"/>
+              <w:jc w:val="center"/>
+            </w:pPr>
+            <w:r>
+              <w:rPr>
+                <w:rFonts w:ascii="Calibri" w:cs="Calibri" w:eastAsia="Calibri" w:hAnsi="Calibri"/>
+                <w:b/>
+                <w:bCs/>
+                <w:color w:val="FFFFFF"/>
+                <w:sz w:val="14"/>
+                <w:szCs w:val="14"/>
+              </w:rPr>
+              <w:t xml:space="preserve">CDO</w:t>
+            </w:r>
+          </w:p>
+        </w:tc>
+        <w:tc>
+          <w:tcPr>
+            <w:tcW w:w="924" w:type="dxa"/>
+            <w:shd w:val="clear" w:color="auto" w:fill="1F3864"/>
+            <w:vAlign w:val="center"/>
+          </w:tcPr>
+          <w:p>
+            <w:pPr>
+              <w:keepNext/>
+              <w:spacing w:before="0" w:after="0" w:line="240" w:lineRule="auto"/>
+              <w:jc w:val="center"/>
+            </w:pPr>
+            <w:r>
+              <w:rPr>
+                <w:rFonts w:ascii="Calibri" w:cs="Calibri" w:eastAsia="Calibri" w:hAnsi="Calibri"/>
+                <w:b/>
+                <w:bCs/>
+                <w:color w:val="FFFFFF"/>
+                <w:sz w:val="14"/>
+                <w:szCs w:val="14"/>
+              </w:rPr>
+              <w:t xml:space="preserve">Comité</w:t>
+            </w:r>
+          </w:p>
+        </w:tc>
+        <w:tc>
+          <w:tcPr>
+            <w:tcW w:w="924" w:type="dxa"/>
+            <w:shd w:val="clear" w:color="auto" w:fill="1F3864"/>
+            <w:vAlign w:val="center"/>
+          </w:tcPr>
+          <w:p>
+            <w:pPr>
+              <w:keepNext/>
+              <w:spacing w:before="0" w:after="0" w:line="240" w:lineRule="auto"/>
+              <w:jc w:val="center"/>
+            </w:pPr>
+            <w:r>
+              <w:rPr>
+                <w:rFonts w:ascii="Calibri" w:cs="Calibri" w:eastAsia="Calibri" w:hAnsi="Calibri"/>
+                <w:b/>
+                <w:bCs/>
+                <w:color w:val="FFFFFF"/>
+                <w:sz w:val="14"/>
+                <w:szCs w:val="14"/>
+              </w:rPr>
+              <w:t xml:space="preserve">DPO</w:t>
+            </w:r>
+          </w:p>
+        </w:tc>
+        <w:tc>
+          <w:tcPr>
+            <w:tcW w:w="924" w:type="dxa"/>
+            <w:shd w:val="clear" w:color="auto" w:fill="1F3864"/>
+            <w:vAlign w:val="center"/>
+          </w:tcPr>
+          <w:p>
+            <w:pPr>
+              <w:keepNext/>
+              <w:spacing w:before="0" w:after="0" w:line="240" w:lineRule="auto"/>
+              <w:jc w:val="center"/>
+            </w:pPr>
+            <w:r>
+              <w:rPr>
+                <w:rFonts w:ascii="Calibri" w:cs="Calibri" w:eastAsia="Calibri" w:hAnsi="Calibri"/>
+                <w:b/>
+                <w:bCs/>
+                <w:color w:val="FFFFFF"/>
+                <w:sz w:val="14"/>
+                <w:szCs w:val="14"/>
+              </w:rPr>
+              <w:t xml:space="preserve">Juridique</w:t>
+            </w:r>
+          </w:p>
+        </w:tc>
+        <w:tc>
+          <w:tcPr>
+            <w:tcW w:w="924" w:type="dxa"/>
+            <w:shd w:val="clear" w:color="auto" w:fill="1F3864"/>
+            <w:vAlign w:val="center"/>
+          </w:tcPr>
+          <w:p>
+            <w:pPr>
+              <w:keepNext/>
+              <w:spacing w:before="0" w:after="0" w:line="240" w:lineRule="auto"/>
+              <w:jc w:val="center"/>
+            </w:pPr>
+            <w:r>
+              <w:rPr>
+                <w:rFonts w:ascii="Calibri" w:cs="Calibri" w:eastAsia="Calibri" w:hAnsi="Calibri"/>
+                <w:b/>
+                <w:bCs/>
+                <w:color w:val="FFFFFF"/>
+                <w:sz w:val="14"/>
+                <w:szCs w:val="14"/>
+              </w:rPr>
+              <w:t xml:space="preserve">Direction propriétaire du domaine</w:t>
+            </w:r>
+          </w:p>
+        </w:tc>
+        <w:tc>
+          <w:tcPr>
+            <w:tcW w:w="924" w:type="dxa"/>
+            <w:shd w:val="clear" w:color="auto" w:fill="1F3864"/>
+            <w:vAlign w:val="center"/>
+          </w:tcPr>
+          <w:p>
+            <w:pPr>
+              <w:keepNext/>
+              <w:spacing w:before="0" w:after="0" w:line="240" w:lineRule="auto"/>
+              <w:jc w:val="center"/>
+            </w:pPr>
+            <w:r>
+              <w:rPr>
+                <w:rFonts w:ascii="Calibri" w:cs="Calibri" w:eastAsia="Calibri" w:hAnsi="Calibri"/>
+                <w:b/>
+                <w:bCs/>
+                <w:color w:val="FFFFFF"/>
+                <w:sz w:val="14"/>
+                <w:szCs w:val="14"/>
+              </w:rPr>
+              <w:t xml:space="preserve">Responsable ingénierie</w:t>
+            </w:r>
+          </w:p>
+        </w:tc>
+        <w:tc>
+          <w:tcPr>
+            <w:tcW w:w="924" w:type="dxa"/>
+            <w:shd w:val="clear" w:color="auto" w:fill="1F3864"/>
+            <w:vAlign w:val="center"/>
+          </w:tcPr>
+          <w:p>
+            <w:pPr>
+              <w:keepNext/>
+              <w:spacing w:before="0" w:after="0" w:line="240" w:lineRule="auto"/>
+              <w:jc w:val="center"/>
+            </w:pPr>
+            <w:r>
+              <w:rPr>
+                <w:rFonts w:ascii="Calibri" w:cs="Calibri" w:eastAsia="Calibri" w:hAnsi="Calibri"/>
+                <w:b/>
+                <w:bCs/>
+                <w:color w:val="FFFFFF"/>
+                <w:sz w:val="14"/>
+                <w:szCs w:val="14"/>
+              </w:rPr>
+              <w:t xml:space="preserve">Data Steward du domaine</w:t>
+            </w:r>
+          </w:p>
+        </w:tc>
+        <w:tc>
+          <w:tcPr>
+            <w:tcW w:w="924" w:type="dxa"/>
+            <w:shd w:val="clear" w:color="auto" w:fill="1F3864"/>
+            <w:vAlign w:val="center"/>
+          </w:tcPr>
+          <w:p>
+            <w:pPr>
+              <w:keepNext/>
+              <w:spacing w:before="0" w:after="0" w:line="240" w:lineRule="auto"/>
+              <w:jc w:val="center"/>
+            </w:pPr>
+            <w:r>
+              <w:rPr>
+                <w:rFonts w:ascii="Calibri" w:cs="Calibri" w:eastAsia="Calibri" w:hAnsi="Calibri"/>
+                <w:b/>
+                <w:bCs/>
+                <w:color w:val="FFFFFF"/>
+                <w:sz w:val="14"/>
+                <w:szCs w:val="14"/>
+              </w:rPr>
+              <w:t xml:space="preserve">Data Steward IA</w:t>
+            </w:r>
+          </w:p>
+        </w:tc>
+      </w:tr>
+      <w:tr>
+        <w:trPr>
+          <w:cantSplit/>
+        </w:trPr>
+        <w:tc>
+          <w:tcPr>
+            <w:tcW w:w="2246" w:type="dxa"/>
+            <w:vAlign w:val="center"/>
+          </w:tcPr>
+          <w:p>
+            <w:pPr>
+              <w:keepNext/>
+              <w:spacing w:before="0" w:after="0" w:line="240" w:lineRule="auto"/>
+              <w:jc w:val="left"/>
+            </w:pPr>
+            <w:r>
+              <w:rPr>
+                <w:rFonts w:ascii="Calibri" w:cs="Calibri" w:eastAsia="Calibri" w:hAnsi="Calibri"/>
+                <w:b/>
+                <w:bCs/>
+                <w:color w:val="1F3864"/>
+                <w:sz w:val="17"/>
+                <w:szCs w:val="17"/>
+              </w:rPr>
+              <w:t xml:space="preserve">Définir la stratégie de gouvernance</w:t>
+            </w:r>
+          </w:p>
+        </w:tc>
+        <w:tc>
+          <w:tcPr>
+            <w:tcW w:w="924" w:type="dxa"/>
+            <w:vAlign w:val="center"/>
+          </w:tcPr>
+          <w:p>
+            <w:pPr>
+              <w:keepNext/>
+              <w:spacing w:before="0" w:after="0" w:line="240" w:lineRule="auto"/>
+              <w:jc w:val="center"/>
+            </w:pPr>
+            <w:r>
+              <w:rPr>
+                <w:rFonts w:ascii="Calibri" w:cs="Calibri" w:eastAsia="Calibri" w:hAnsi="Calibri"/>
+                <w:b/>
+                <w:bCs/>
+                <w:color w:val="1F3864"/>
+                <w:sz w:val="17"/>
+                <w:szCs w:val="17"/>
+              </w:rPr>
+              <w:t xml:space="preserve">A/R</w:t>
+            </w:r>
+          </w:p>
+        </w:tc>
+        <w:tc>
+          <w:tcPr>
+            <w:tcW w:w="924" w:type="dxa"/>
+            <w:vAlign w:val="center"/>
+          </w:tcPr>
+          <w:p>
+            <w:pPr>
+              <w:keepNext/>
+              <w:spacing w:before="0" w:after="0" w:line="240" w:lineRule="auto"/>
+              <w:jc w:val="center"/>
+            </w:pPr>
+            <w:r>
+              <w:rPr>
+                <w:rFonts w:ascii="Calibri" w:cs="Calibri" w:eastAsia="Calibri" w:hAnsi="Calibri"/>
+                <w:color w:val="1A1A1A"/>
+                <w:sz w:val="17"/>
+                <w:szCs w:val="17"/>
+              </w:rPr>
+              <w:t xml:space="preserve">C</w:t>
+            </w:r>
+          </w:p>
+        </w:tc>
+        <w:tc>
+          <w:tcPr>
+            <w:tcW w:w="924" w:type="dxa"/>
+            <w:vAlign w:val="center"/>
+          </w:tcPr>
+          <w:p>
+            <w:pPr>
+              <w:keepNext/>
+              <w:spacing w:before="0" w:after="0" w:line="240" w:lineRule="auto"/>
+              <w:jc w:val="center"/>
+            </w:pPr>
+            <w:r>
+              <w:rPr>
+                <w:rFonts w:ascii="Calibri" w:cs="Calibri" w:eastAsia="Calibri" w:hAnsi="Calibri"/>
+                <w:color w:val="1A1A1A"/>
+                <w:sz w:val="17"/>
+                <w:szCs w:val="17"/>
+              </w:rPr>
+              <w:t xml:space="preserve">C</w:t>
+            </w:r>
+          </w:p>
+        </w:tc>
+        <w:tc>
+          <w:tcPr>
+            <w:tcW w:w="924" w:type="dxa"/>
+            <w:vAlign w:val="center"/>
+          </w:tcPr>
+          <w:p>
+            <w:pPr>
+              <w:keepNext/>
+              <w:spacing w:before="0" w:after="0" w:line="240" w:lineRule="auto"/>
+              <w:jc w:val="center"/>
+            </w:pPr>
+            <w:r>
+              <w:rPr>
+                <w:rFonts w:ascii="Calibri" w:cs="Calibri" w:eastAsia="Calibri" w:hAnsi="Calibri"/>
+                <w:color w:val="1A1A1A"/>
+                <w:sz w:val="17"/>
+                <w:szCs w:val="17"/>
+              </w:rPr>
+              <w:t xml:space="preserve">C</w:t>
+            </w:r>
+          </w:p>
+        </w:tc>
+        <w:tc>
+          <w:tcPr>
+            <w:tcW w:w="924" w:type="dxa"/>
+            <w:vAlign w:val="center"/>
+          </w:tcPr>
+          <w:p>
+            <w:pPr>
+              <w:keepNext/>
+              <w:spacing w:before="0" w:after="0" w:line="240" w:lineRule="auto"/>
+              <w:jc w:val="center"/>
+            </w:pPr>
+            <w:r>
+              <w:rPr>
+                <w:rFonts w:ascii="Calibri" w:cs="Calibri" w:eastAsia="Calibri" w:hAnsi="Calibri"/>
+                <w:color w:val="1A1A1A"/>
+                <w:sz w:val="17"/>
+                <w:szCs w:val="17"/>
+              </w:rPr>
+              <w:t xml:space="preserve">C</w:t>
+            </w:r>
+          </w:p>
+        </w:tc>
+        <w:tc>
+          <w:tcPr>
+            <w:tcW w:w="924" w:type="dxa"/>
+            <w:vAlign w:val="center"/>
+          </w:tcPr>
+          <w:p>
+            <w:pPr>
+              <w:keepNext/>
+              <w:spacing w:before="0" w:after="0" w:line="240" w:lineRule="auto"/>
+              <w:jc w:val="center"/>
+            </w:pPr>
+            <w:r>
+              <w:rPr>
+                <w:rFonts w:ascii="Calibri" w:cs="Calibri" w:eastAsia="Calibri" w:hAnsi="Calibri"/>
+                <w:color w:val="1A1A1A"/>
+                <w:sz w:val="17"/>
+                <w:szCs w:val="17"/>
+              </w:rPr>
+              <w:t xml:space="preserve">C</w:t>
+            </w:r>
+          </w:p>
+        </w:tc>
+        <w:tc>
+          <w:tcPr>
+            <w:tcW w:w="924" w:type="dxa"/>
+            <w:vAlign w:val="center"/>
+          </w:tcPr>
+          <w:p>
+            <w:pPr>
+              <w:keepNext/>
+              <w:spacing w:before="0" w:after="0" w:line="240" w:lineRule="auto"/>
+              <w:jc w:val="center"/>
+            </w:pPr>
+            <w:r>
+              <w:rPr>
+                <w:rFonts w:ascii="Calibri" w:cs="Calibri" w:eastAsia="Calibri" w:hAnsi="Calibri"/>
+                <w:color w:val="1A1A1A"/>
+                <w:sz w:val="17"/>
+                <w:szCs w:val="17"/>
+              </w:rPr>
+              <w:t xml:space="preserve">I</w:t>
+            </w:r>
+          </w:p>
+        </w:tc>
+        <w:tc>
+          <w:tcPr>
+            <w:tcW w:w="924" w:type="dxa"/>
+            <w:vAlign w:val="center"/>
+          </w:tcPr>
+          <w:p>
+            <w:pPr>
+              <w:keepNext/>
+              <w:spacing w:before="0" w:after="0" w:line="240" w:lineRule="auto"/>
+              <w:jc w:val="center"/>
+            </w:pPr>
+            <w:r>
+              <w:rPr>
+                <w:rFonts w:ascii="Calibri" w:cs="Calibri" w:eastAsia="Calibri" w:hAnsi="Calibri"/>
+                <w:color w:val="1A1A1A"/>
+                <w:sz w:val="17"/>
+                <w:szCs w:val="17"/>
+              </w:rPr>
+              <w:t xml:space="preserve">I</w:t>
+            </w:r>
+          </w:p>
+        </w:tc>
+      </w:tr>
+      <w:tr>
+        <w:trPr>
+          <w:cantSplit/>
+        </w:trPr>
+        <w:tc>
+          <w:tcPr>
+            <w:tcW w:w="2246" w:type="dxa"/>
+            <w:shd w:val="clear" w:color="auto" w:fill="F2F6FB"/>
+            <w:vAlign w:val="center"/>
+          </w:tcPr>
+          <w:p>
+            <w:pPr>
+              <w:keepNext/>
+              <w:spacing w:before="0" w:after="0" w:line="240" w:lineRule="auto"/>
+              <w:jc w:val="left"/>
+            </w:pPr>
+            <w:r>
+              <w:rPr>
+                <w:rFonts w:ascii="Calibri" w:cs="Calibri" w:eastAsia="Calibri" w:hAnsi="Calibri"/>
+                <w:b/>
+                <w:bCs/>
+                <w:color w:val="1F3864"/>
+                <w:sz w:val="17"/>
+                <w:szCs w:val="17"/>
+              </w:rPr>
+              <w:t xml:space="preserve">Examiner et valider les politiques et standards</w:t>
+            </w:r>
+          </w:p>
+        </w:tc>
+        <w:tc>
+          <w:tcPr>
+            <w:tcW w:w="924" w:type="dxa"/>
+            <w:shd w:val="clear" w:color="auto" w:fill="F2F6FB"/>
+            <w:vAlign w:val="center"/>
+          </w:tcPr>
+          <w:p>
+            <w:pPr>
+              <w:keepNext/>
+              <w:spacing w:before="0" w:after="0" w:line="240" w:lineRule="auto"/>
+              <w:jc w:val="center"/>
+            </w:pPr>
+            <w:r>
+              <w:rPr>
+                <w:rFonts w:ascii="Calibri" w:cs="Calibri" w:eastAsia="Calibri" w:hAnsi="Calibri"/>
+                <w:b/>
+                <w:bCs/>
+                <w:color w:val="1F3864"/>
+                <w:sz w:val="17"/>
+                <w:szCs w:val="17"/>
+              </w:rPr>
+              <w:t xml:space="preserve">A</w:t>
+            </w:r>
+          </w:p>
+        </w:tc>
+        <w:tc>
+          <w:tcPr>
+            <w:tcW w:w="924" w:type="dxa"/>
+            <w:shd w:val="clear" w:color="auto" w:fill="F2F6FB"/>
+            <w:vAlign w:val="center"/>
+          </w:tcPr>
+          <w:p>
+            <w:pPr>
+              <w:keepNext/>
+              <w:spacing w:before="0" w:after="0" w:line="240" w:lineRule="auto"/>
+              <w:jc w:val="center"/>
+            </w:pPr>
+            <w:r>
+              <w:rPr>
+                <w:rFonts w:ascii="Calibri" w:cs="Calibri" w:eastAsia="Calibri" w:hAnsi="Calibri"/>
+                <w:color w:val="1A1A1A"/>
+                <w:sz w:val="17"/>
+                <w:szCs w:val="17"/>
+              </w:rPr>
+              <w:t xml:space="preserve">R</w:t>
+            </w:r>
+          </w:p>
+        </w:tc>
+        <w:tc>
+          <w:tcPr>
+            <w:tcW w:w="924" w:type="dxa"/>
+            <w:shd w:val="clear" w:color="auto" w:fill="F2F6FB"/>
+            <w:vAlign w:val="center"/>
+          </w:tcPr>
+          <w:p>
+            <w:pPr>
+              <w:keepNext/>
+              <w:spacing w:before="0" w:after="0" w:line="240" w:lineRule="auto"/>
+              <w:jc w:val="center"/>
+            </w:pPr>
+            <w:r>
+              <w:rPr>
+                <w:rFonts w:ascii="Calibri" w:cs="Calibri" w:eastAsia="Calibri" w:hAnsi="Calibri"/>
+                <w:color w:val="1A1A1A"/>
+                <w:sz w:val="17"/>
+                <w:szCs w:val="17"/>
+              </w:rPr>
+              <w:t xml:space="preserve">C</w:t>
+            </w:r>
+          </w:p>
+        </w:tc>
+        <w:tc>
+          <w:tcPr>
+            <w:tcW w:w="924" w:type="dxa"/>
+            <w:shd w:val="clear" w:color="auto" w:fill="F2F6FB"/>
+            <w:vAlign w:val="center"/>
+          </w:tcPr>
+          <w:p>
+            <w:pPr>
+              <w:keepNext/>
+              <w:spacing w:before="0" w:after="0" w:line="240" w:lineRule="auto"/>
+              <w:jc w:val="center"/>
+            </w:pPr>
+            <w:r>
+              <w:rPr>
+                <w:rFonts w:ascii="Calibri" w:cs="Calibri" w:eastAsia="Calibri" w:hAnsi="Calibri"/>
+                <w:color w:val="1A1A1A"/>
+                <w:sz w:val="17"/>
+                <w:szCs w:val="17"/>
+              </w:rPr>
+              <w:t xml:space="preserve">C</w:t>
+            </w:r>
+          </w:p>
+        </w:tc>
+        <w:tc>
+          <w:tcPr>
+            <w:tcW w:w="924" w:type="dxa"/>
+            <w:shd w:val="clear" w:color="auto" w:fill="F2F6FB"/>
+            <w:vAlign w:val="center"/>
+          </w:tcPr>
+          <w:p>
+            <w:pPr>
+              <w:keepNext/>
+              <w:spacing w:before="0" w:after="0" w:line="240" w:lineRule="auto"/>
+              <w:jc w:val="center"/>
+            </w:pPr>
+            <w:r>
+              <w:rPr>
+                <w:rFonts w:ascii="Calibri" w:cs="Calibri" w:eastAsia="Calibri" w:hAnsi="Calibri"/>
+                <w:color w:val="1A1A1A"/>
+                <w:sz w:val="17"/>
+                <w:szCs w:val="17"/>
+              </w:rPr>
+              <w:t xml:space="preserve">C</w:t>
+            </w:r>
+          </w:p>
+        </w:tc>
+        <w:tc>
+          <w:tcPr>
+            <w:tcW w:w="924" w:type="dxa"/>
+            <w:shd w:val="clear" w:color="auto" w:fill="F2F6FB"/>
+            <w:vAlign w:val="center"/>
+          </w:tcPr>
+          <w:p>
+            <w:pPr>
+              <w:keepNext/>
+              <w:spacing w:before="0" w:after="0" w:line="240" w:lineRule="auto"/>
+              <w:jc w:val="center"/>
+            </w:pPr>
+            <w:r>
+              <w:rPr>
+                <w:rFonts w:ascii="Calibri" w:cs="Calibri" w:eastAsia="Calibri" w:hAnsi="Calibri"/>
+                <w:color w:val="1A1A1A"/>
+                <w:sz w:val="17"/>
+                <w:szCs w:val="17"/>
+              </w:rPr>
+              <w:t xml:space="preserve">C</w:t>
+            </w:r>
+          </w:p>
+        </w:tc>
+        <w:tc>
+          <w:tcPr>
+            <w:tcW w:w="924" w:type="dxa"/>
+            <w:shd w:val="clear" w:color="auto" w:fill="F2F6FB"/>
+            <w:vAlign w:val="center"/>
+          </w:tcPr>
+          <w:p>
+            <w:pPr>
+              <w:keepNext/>
+              <w:spacing w:before="0" w:after="0" w:line="240" w:lineRule="auto"/>
+              <w:jc w:val="center"/>
+            </w:pPr>
+            <w:r>
+              <w:rPr>
+                <w:rFonts w:ascii="Calibri" w:cs="Calibri" w:eastAsia="Calibri" w:hAnsi="Calibri"/>
+                <w:color w:val="1A1A1A"/>
+                <w:sz w:val="17"/>
+                <w:szCs w:val="17"/>
+              </w:rPr>
+              <w:t xml:space="preserve">I</w:t>
+            </w:r>
+          </w:p>
+        </w:tc>
+        <w:tc>
+          <w:tcPr>
+            <w:tcW w:w="924" w:type="dxa"/>
+            <w:shd w:val="clear" w:color="auto" w:fill="F2F6FB"/>
+            <w:vAlign w:val="center"/>
+          </w:tcPr>
+          <w:p>
+            <w:pPr>
+              <w:keepNext/>
+              <w:spacing w:before="0" w:after="0" w:line="240" w:lineRule="auto"/>
+              <w:jc w:val="center"/>
+            </w:pPr>
+            <w:r>
+              <w:rPr>
+                <w:rFonts w:ascii="Calibri" w:cs="Calibri" w:eastAsia="Calibri" w:hAnsi="Calibri"/>
+                <w:color w:val="1A1A1A"/>
+                <w:sz w:val="17"/>
+                <w:szCs w:val="17"/>
+              </w:rPr>
+              <w:t xml:space="preserve">I</w:t>
+            </w:r>
+          </w:p>
+        </w:tc>
+      </w:tr>
+      <w:tr>
+        <w:trPr>
+          <w:cantSplit/>
+        </w:trPr>
+        <w:tc>
+          <w:tcPr>
+            <w:tcW w:w="2246" w:type="dxa"/>
+            <w:vAlign w:val="center"/>
+          </w:tcPr>
+          <w:p>
+            <w:pPr>
+              <w:keepNext/>
+              <w:spacing w:before="0" w:after="0" w:line="240" w:lineRule="auto"/>
+              <w:jc w:val="left"/>
+            </w:pPr>
+            <w:r>
+              <w:rPr>
+                <w:rFonts w:ascii="Calibri" w:cs="Calibri" w:eastAsia="Calibri" w:hAnsi="Calibri"/>
+                <w:b/>
+                <w:bCs/>
+                <w:color w:val="1F3864"/>
+                <w:sz w:val="17"/>
+                <w:szCs w:val="17"/>
+              </w:rPr>
+              <w:t xml:space="preserve">Fixer les exigences de qualité d'un domaine (indicateur, seuil)</w:t>
+            </w:r>
+          </w:p>
+        </w:tc>
+        <w:tc>
+          <w:tcPr>
+            <w:tcW w:w="924" w:type="dxa"/>
+            <w:vAlign w:val="center"/>
+          </w:tcPr>
+          <w:p>
+            <w:pPr>
+              <w:keepNext/>
+              <w:spacing w:before="0" w:after="0" w:line="240" w:lineRule="auto"/>
+              <w:jc w:val="center"/>
+            </w:pPr>
+            <w:r>
+              <w:rPr>
+                <w:rFonts w:ascii="Calibri" w:cs="Calibri" w:eastAsia="Calibri" w:hAnsi="Calibri"/>
+                <w:color w:val="1A1A1A"/>
+                <w:sz w:val="17"/>
+                <w:szCs w:val="17"/>
+              </w:rPr>
+              <w:t xml:space="preserve">I</w:t>
+            </w:r>
+          </w:p>
+        </w:tc>
+        <w:tc>
+          <w:tcPr>
+            <w:tcW w:w="924" w:type="dxa"/>
+            <w:vAlign w:val="center"/>
+          </w:tcPr>
+          <w:p>
+            <w:pPr>
+              <w:keepNext/>
+              <w:spacing w:before="0" w:after="0" w:line="240" w:lineRule="auto"/>
+              <w:jc w:val="center"/>
+            </w:pPr>
+            <w:r>
+              <w:rPr>
+                <w:rFonts w:ascii="Calibri" w:cs="Calibri" w:eastAsia="Calibri" w:hAnsi="Calibri"/>
+                <w:color w:val="1A1A1A"/>
+                <w:sz w:val="17"/>
+                <w:szCs w:val="17"/>
+              </w:rPr>
+              <w:t xml:space="preserve">I</w:t>
+            </w:r>
+          </w:p>
+        </w:tc>
+        <w:tc>
+          <w:tcPr>
+            <w:tcW w:w="924" w:type="dxa"/>
+            <w:vAlign w:val="center"/>
+          </w:tcPr>
+          <w:p>
+            <w:pPr>
+              <w:keepNext/>
+              <w:spacing w:before="0" w:after="0" w:line="240" w:lineRule="auto"/>
+              <w:jc w:val="center"/>
+            </w:pPr>
+          </w:p>
+        </w:tc>
+        <w:tc>
+          <w:tcPr>
+            <w:tcW w:w="924" w:type="dxa"/>
+            <w:vAlign w:val="center"/>
+          </w:tcPr>
+          <w:p>
+            <w:pPr>
+              <w:keepNext/>
+              <w:spacing w:before="0" w:after="0" w:line="240" w:lineRule="auto"/>
+              <w:jc w:val="center"/>
+            </w:pPr>
+          </w:p>
+        </w:tc>
+        <w:tc>
+          <w:tcPr>
+            <w:tcW w:w="924" w:type="dxa"/>
+            <w:vAlign w:val="center"/>
+          </w:tcPr>
+          <w:p>
+            <w:pPr>
+              <w:keepNext/>
+              <w:spacing w:before="0" w:after="0" w:line="240" w:lineRule="auto"/>
+              <w:jc w:val="center"/>
+            </w:pPr>
+            <w:r>
+              <w:rPr>
+                <w:rFonts w:ascii="Calibri" w:cs="Calibri" w:eastAsia="Calibri" w:hAnsi="Calibri"/>
+                <w:b/>
+                <w:bCs/>
+                <w:color w:val="1F3864"/>
+                <w:sz w:val="17"/>
+                <w:szCs w:val="17"/>
+              </w:rPr>
+              <w:t xml:space="preserve">A</w:t>
+            </w:r>
+          </w:p>
+        </w:tc>
+        <w:tc>
+          <w:tcPr>
+            <w:tcW w:w="924" w:type="dxa"/>
+            <w:vAlign w:val="center"/>
+          </w:tcPr>
+          <w:p>
+            <w:pPr>
+              <w:keepNext/>
+              <w:spacing w:before="0" w:after="0" w:line="240" w:lineRule="auto"/>
+              <w:jc w:val="center"/>
+            </w:pPr>
+          </w:p>
+        </w:tc>
+        <w:tc>
+          <w:tcPr>
+            <w:tcW w:w="924" w:type="dxa"/>
+            <w:vAlign w:val="center"/>
+          </w:tcPr>
+          <w:p>
+            <w:pPr>
+              <w:keepNext/>
+              <w:spacing w:before="0" w:after="0" w:line="240" w:lineRule="auto"/>
+              <w:jc w:val="center"/>
+            </w:pPr>
+            <w:r>
+              <w:rPr>
+                <w:rFonts w:ascii="Calibri" w:cs="Calibri" w:eastAsia="Calibri" w:hAnsi="Calibri"/>
+                <w:color w:val="1A1A1A"/>
+                <w:sz w:val="17"/>
+                <w:szCs w:val="17"/>
+              </w:rPr>
+              <w:t xml:space="preserve">R</w:t>
+            </w:r>
+          </w:p>
+        </w:tc>
+        <w:tc>
+          <w:tcPr>
+            <w:tcW w:w="924" w:type="dxa"/>
+            <w:vAlign w:val="center"/>
+          </w:tcPr>
+          <w:p>
+            <w:pPr>
+              <w:keepNext/>
+              <w:spacing w:before="0" w:after="0" w:line="240" w:lineRule="auto"/>
+              <w:jc w:val="center"/>
+            </w:pPr>
+            <w:r>
+              <w:rPr>
+                <w:rFonts w:ascii="Calibri" w:cs="Calibri" w:eastAsia="Calibri" w:hAnsi="Calibri"/>
+                <w:color w:val="1A1A1A"/>
+                <w:sz w:val="17"/>
+                <w:szCs w:val="17"/>
+              </w:rPr>
+              <w:t xml:space="preserve">C</w:t>
+            </w:r>
+          </w:p>
+        </w:tc>
+      </w:tr>
+      <w:tr>
+        <w:trPr>
+          <w:cantSplit/>
+        </w:trPr>
+        <w:tc>
+          <w:tcPr>
+            <w:tcW w:w="2246" w:type="dxa"/>
+            <w:shd w:val="clear" w:color="auto" w:fill="F2F6FB"/>
+            <w:vAlign w:val="center"/>
+          </w:tcPr>
+          <w:p>
+            <w:pPr>
+              <w:keepNext/>
+              <w:spacing w:before="0" w:after="0" w:line="240" w:lineRule="auto"/>
+              <w:jc w:val="left"/>
+            </w:pPr>
+            <w:r>
+              <w:rPr>
+                <w:rFonts w:ascii="Calibri" w:cs="Calibri" w:eastAsia="Calibri" w:hAnsi="Calibri"/>
+                <w:b/>
+                <w:bCs/>
+                <w:color w:val="1F3864"/>
+                <w:sz w:val="17"/>
+                <w:szCs w:val="17"/>
+              </w:rPr>
+              <w:t xml:space="preserve">Profiler et corriger les données (remédiation)</w:t>
+            </w:r>
+          </w:p>
+        </w:tc>
+        <w:tc>
+          <w:tcPr>
+            <w:tcW w:w="924" w:type="dxa"/>
+            <w:shd w:val="clear" w:color="auto" w:fill="F2F6FB"/>
+            <w:vAlign w:val="center"/>
+          </w:tcPr>
+          <w:p>
+            <w:pPr>
+              <w:keepNext/>
+              <w:spacing w:before="0" w:after="0" w:line="240" w:lineRule="auto"/>
+              <w:jc w:val="center"/>
+            </w:pPr>
+            <w:r>
+              <w:rPr>
+                <w:rFonts w:ascii="Calibri" w:cs="Calibri" w:eastAsia="Calibri" w:hAnsi="Calibri"/>
+                <w:color w:val="1A1A1A"/>
+                <w:sz w:val="17"/>
+                <w:szCs w:val="17"/>
+              </w:rPr>
+              <w:t xml:space="preserve">I</w:t>
+            </w:r>
+          </w:p>
+        </w:tc>
+        <w:tc>
+          <w:tcPr>
+            <w:tcW w:w="924" w:type="dxa"/>
+            <w:shd w:val="clear" w:color="auto" w:fill="F2F6FB"/>
+            <w:vAlign w:val="center"/>
+          </w:tcPr>
+          <w:p>
+            <w:pPr>
+              <w:keepNext/>
+              <w:spacing w:before="0" w:after="0" w:line="240" w:lineRule="auto"/>
+              <w:jc w:val="center"/>
+            </w:pPr>
+          </w:p>
+        </w:tc>
+        <w:tc>
+          <w:tcPr>
+            <w:tcW w:w="924" w:type="dxa"/>
+            <w:shd w:val="clear" w:color="auto" w:fill="F2F6FB"/>
+            <w:vAlign w:val="center"/>
+          </w:tcPr>
+          <w:p>
+            <w:pPr>
+              <w:keepNext/>
+              <w:spacing w:before="0" w:after="0" w:line="240" w:lineRule="auto"/>
+              <w:jc w:val="center"/>
+            </w:pPr>
+          </w:p>
+        </w:tc>
+        <w:tc>
+          <w:tcPr>
+            <w:tcW w:w="924" w:type="dxa"/>
+            <w:shd w:val="clear" w:color="auto" w:fill="F2F6FB"/>
+            <w:vAlign w:val="center"/>
+          </w:tcPr>
+          <w:p>
+            <w:pPr>
+              <w:keepNext/>
+              <w:spacing w:before="0" w:after="0" w:line="240" w:lineRule="auto"/>
+              <w:jc w:val="center"/>
+            </w:pPr>
+          </w:p>
+        </w:tc>
+        <w:tc>
+          <w:tcPr>
+            <w:tcW w:w="924" w:type="dxa"/>
+            <w:shd w:val="clear" w:color="auto" w:fill="F2F6FB"/>
+            <w:vAlign w:val="center"/>
+          </w:tcPr>
+          <w:p>
+            <w:pPr>
+              <w:keepNext/>
+              <w:spacing w:before="0" w:after="0" w:line="240" w:lineRule="auto"/>
+              <w:jc w:val="center"/>
+            </w:pPr>
+            <w:r>
+              <w:rPr>
+                <w:rFonts w:ascii="Calibri" w:cs="Calibri" w:eastAsia="Calibri" w:hAnsi="Calibri"/>
+                <w:b/>
+                <w:bCs/>
+                <w:color w:val="1F3864"/>
+                <w:sz w:val="17"/>
+                <w:szCs w:val="17"/>
+              </w:rPr>
+              <w:t xml:space="preserve">A</w:t>
+            </w:r>
+          </w:p>
+        </w:tc>
+        <w:tc>
+          <w:tcPr>
+            <w:tcW w:w="924" w:type="dxa"/>
+            <w:shd w:val="clear" w:color="auto" w:fill="F2F6FB"/>
+            <w:vAlign w:val="center"/>
+          </w:tcPr>
+          <w:p>
+            <w:pPr>
+              <w:keepNext/>
+              <w:spacing w:before="0" w:after="0" w:line="240" w:lineRule="auto"/>
+              <w:jc w:val="center"/>
+            </w:pPr>
+            <w:r>
+              <w:rPr>
+                <w:rFonts w:ascii="Calibri" w:cs="Calibri" w:eastAsia="Calibri" w:hAnsi="Calibri"/>
+                <w:color w:val="1A1A1A"/>
+                <w:sz w:val="17"/>
+                <w:szCs w:val="17"/>
+              </w:rPr>
+              <w:t xml:space="preserve">C</w:t>
+            </w:r>
+          </w:p>
+        </w:tc>
+        <w:tc>
+          <w:tcPr>
+            <w:tcW w:w="924" w:type="dxa"/>
+            <w:shd w:val="clear" w:color="auto" w:fill="F2F6FB"/>
+            <w:vAlign w:val="center"/>
+          </w:tcPr>
+          <w:p>
+            <w:pPr>
+              <w:keepNext/>
+              <w:spacing w:before="0" w:after="0" w:line="240" w:lineRule="auto"/>
+              <w:jc w:val="center"/>
+            </w:pPr>
+            <w:r>
+              <w:rPr>
+                <w:rFonts w:ascii="Calibri" w:cs="Calibri" w:eastAsia="Calibri" w:hAnsi="Calibri"/>
+                <w:color w:val="1A1A1A"/>
+                <w:sz w:val="17"/>
+                <w:szCs w:val="17"/>
+              </w:rPr>
+              <w:t xml:space="preserve">R</w:t>
+            </w:r>
+          </w:p>
+        </w:tc>
+        <w:tc>
+          <w:tcPr>
+            <w:tcW w:w="924" w:type="dxa"/>
+            <w:shd w:val="clear" w:color="auto" w:fill="F2F6FB"/>
+            <w:vAlign w:val="center"/>
+          </w:tcPr>
+          <w:p>
+            <w:pPr>
+              <w:keepNext/>
+              <w:spacing w:before="0" w:after="0" w:line="240" w:lineRule="auto"/>
+              <w:jc w:val="center"/>
+            </w:pPr>
+          </w:p>
+        </w:tc>
+      </w:tr>
+      <w:tr>
+        <w:trPr>
+          <w:cantSplit/>
+        </w:trPr>
+        <w:tc>
+          <w:tcPr>
+            <w:tcW w:w="2246" w:type="dxa"/>
+            <w:vAlign w:val="center"/>
+          </w:tcPr>
+          <w:p>
+            <w:pPr>
+              <w:keepNext/>
+              <w:spacing w:before="0" w:after="0" w:line="240" w:lineRule="auto"/>
+              <w:jc w:val="left"/>
+            </w:pPr>
+            <w:r>
+              <w:rPr>
+                <w:rFonts w:ascii="Calibri" w:cs="Calibri" w:eastAsia="Calibri" w:hAnsi="Calibri"/>
+                <w:b/>
+                <w:bCs/>
+                <w:color w:val="1F3864"/>
+                <w:sz w:val="17"/>
+                <w:szCs w:val="17"/>
+              </w:rPr>
+              <w:t xml:space="preserve">Attribuer les droits d'accès (RBAC, moindre privilège)</w:t>
+            </w:r>
+          </w:p>
+        </w:tc>
+        <w:tc>
+          <w:tcPr>
+            <w:tcW w:w="924" w:type="dxa"/>
+            <w:vAlign w:val="center"/>
+          </w:tcPr>
+          <w:p>
+            <w:pPr>
+              <w:keepNext/>
+              <w:spacing w:before="0" w:after="0" w:line="240" w:lineRule="auto"/>
+              <w:jc w:val="center"/>
+            </w:pPr>
+            <w:r>
+              <w:rPr>
+                <w:rFonts w:ascii="Calibri" w:cs="Calibri" w:eastAsia="Calibri" w:hAnsi="Calibri"/>
+                <w:color w:val="1A1A1A"/>
+                <w:sz w:val="17"/>
+                <w:szCs w:val="17"/>
+              </w:rPr>
+              <w:t xml:space="preserve">I</w:t>
+            </w:r>
+          </w:p>
+        </w:tc>
+        <w:tc>
+          <w:tcPr>
+            <w:tcW w:w="924" w:type="dxa"/>
+            <w:vAlign w:val="center"/>
+          </w:tcPr>
+          <w:p>
+            <w:pPr>
+              <w:keepNext/>
+              <w:spacing w:before="0" w:after="0" w:line="240" w:lineRule="auto"/>
+              <w:jc w:val="center"/>
+            </w:pPr>
+          </w:p>
+        </w:tc>
+        <w:tc>
+          <w:tcPr>
+            <w:tcW w:w="924" w:type="dxa"/>
+            <w:vAlign w:val="center"/>
+          </w:tcPr>
+          <w:p>
+            <w:pPr>
+              <w:keepNext/>
+              <w:spacing w:before="0" w:after="0" w:line="240" w:lineRule="auto"/>
+              <w:jc w:val="center"/>
+            </w:pPr>
+            <w:r>
+              <w:rPr>
+                <w:rFonts w:ascii="Calibri" w:cs="Calibri" w:eastAsia="Calibri" w:hAnsi="Calibri"/>
+                <w:color w:val="1A1A1A"/>
+                <w:sz w:val="17"/>
+                <w:szCs w:val="17"/>
+              </w:rPr>
+              <w:t xml:space="preserve">C</w:t>
+            </w:r>
+          </w:p>
+        </w:tc>
+        <w:tc>
+          <w:tcPr>
+            <w:tcW w:w="924" w:type="dxa"/>
+            <w:vAlign w:val="center"/>
+          </w:tcPr>
+          <w:p>
+            <w:pPr>
+              <w:keepNext/>
+              <w:spacing w:before="0" w:after="0" w:line="240" w:lineRule="auto"/>
+              <w:jc w:val="center"/>
+            </w:pPr>
+          </w:p>
+        </w:tc>
+        <w:tc>
+          <w:tcPr>
+            <w:tcW w:w="924" w:type="dxa"/>
+            <w:vAlign w:val="center"/>
+          </w:tcPr>
+          <w:p>
+            <w:pPr>
+              <w:keepNext/>
+              <w:spacing w:before="0" w:after="0" w:line="240" w:lineRule="auto"/>
+              <w:jc w:val="center"/>
+            </w:pPr>
+            <w:r>
+              <w:rPr>
+                <w:rFonts w:ascii="Calibri" w:cs="Calibri" w:eastAsia="Calibri" w:hAnsi="Calibri"/>
+                <w:b/>
+                <w:bCs/>
+                <w:color w:val="1F3864"/>
+                <w:sz w:val="17"/>
+                <w:szCs w:val="17"/>
+              </w:rPr>
+              <w:t xml:space="preserve">A</w:t>
+            </w:r>
+          </w:p>
+        </w:tc>
+        <w:tc>
+          <w:tcPr>
+            <w:tcW w:w="924" w:type="dxa"/>
+            <w:vAlign w:val="center"/>
+          </w:tcPr>
+          <w:p>
+            <w:pPr>
+              <w:keepNext/>
+              <w:spacing w:before="0" w:after="0" w:line="240" w:lineRule="auto"/>
+              <w:jc w:val="center"/>
+            </w:pPr>
+            <w:r>
+              <w:rPr>
+                <w:rFonts w:ascii="Calibri" w:cs="Calibri" w:eastAsia="Calibri" w:hAnsi="Calibri"/>
+                <w:color w:val="1A1A1A"/>
+                <w:sz w:val="17"/>
+                <w:szCs w:val="17"/>
+              </w:rPr>
+              <w:t xml:space="preserve">R</w:t>
+            </w:r>
+          </w:p>
+        </w:tc>
+        <w:tc>
+          <w:tcPr>
+            <w:tcW w:w="924" w:type="dxa"/>
+            <w:vAlign w:val="center"/>
+          </w:tcPr>
+          <w:p>
+            <w:pPr>
+              <w:keepNext/>
+              <w:spacing w:before="0" w:after="0" w:line="240" w:lineRule="auto"/>
+              <w:jc w:val="center"/>
+            </w:pPr>
+            <w:r>
+              <w:rPr>
+                <w:rFonts w:ascii="Calibri" w:cs="Calibri" w:eastAsia="Calibri" w:hAnsi="Calibri"/>
+                <w:color w:val="1A1A1A"/>
+                <w:sz w:val="17"/>
+                <w:szCs w:val="17"/>
+              </w:rPr>
+              <w:t xml:space="preserve">R</w:t>
+            </w:r>
+          </w:p>
+        </w:tc>
+        <w:tc>
+          <w:tcPr>
+            <w:tcW w:w="924" w:type="dxa"/>
+            <w:vAlign w:val="center"/>
+          </w:tcPr>
+          <w:p>
+            <w:pPr>
+              <w:keepNext/>
+              <w:spacing w:before="0" w:after="0" w:line="240" w:lineRule="auto"/>
+              <w:jc w:val="center"/>
+            </w:pPr>
+          </w:p>
+        </w:tc>
+      </w:tr>
+      <w:tr>
+        <w:trPr>
+          <w:cantSplit/>
+        </w:trPr>
+        <w:tc>
+          <w:tcPr>
+            <w:tcW w:w="2246" w:type="dxa"/>
+            <w:shd w:val="clear" w:color="auto" w:fill="F2F6FB"/>
+            <w:vAlign w:val="center"/>
+          </w:tcPr>
+          <w:p>
+            <w:pPr>
+              <w:keepNext/>
+              <w:spacing w:before="0" w:after="0" w:line="240" w:lineRule="auto"/>
+              <w:jc w:val="left"/>
+            </w:pPr>
+            <w:r>
+              <w:rPr>
+                <w:rFonts w:ascii="Calibri" w:cs="Calibri" w:eastAsia="Calibri" w:hAnsi="Calibri"/>
+                <w:b/>
+                <w:bCs/>
+                <w:color w:val="1F3864"/>
+                <w:sz w:val="17"/>
+                <w:szCs w:val="17"/>
+              </w:rPr>
+              <w:t xml:space="preserve">Sécuriser l'infrastructure (chiffrement, journalisation, PCI-DSS)</w:t>
+            </w:r>
+          </w:p>
+        </w:tc>
+        <w:tc>
+          <w:tcPr>
+            <w:tcW w:w="924" w:type="dxa"/>
+            <w:shd w:val="clear" w:color="auto" w:fill="F2F6FB"/>
+            <w:vAlign w:val="center"/>
+          </w:tcPr>
+          <w:p>
+            <w:pPr>
+              <w:keepNext/>
+              <w:spacing w:before="0" w:after="0" w:line="240" w:lineRule="auto"/>
+              <w:jc w:val="center"/>
+            </w:pPr>
+            <w:r>
+              <w:rPr>
+                <w:rFonts w:ascii="Calibri" w:cs="Calibri" w:eastAsia="Calibri" w:hAnsi="Calibri"/>
+                <w:color w:val="1A1A1A"/>
+                <w:sz w:val="17"/>
+                <w:szCs w:val="17"/>
+              </w:rPr>
+              <w:t xml:space="preserve">I</w:t>
+            </w:r>
+          </w:p>
+        </w:tc>
+        <w:tc>
+          <w:tcPr>
+            <w:tcW w:w="924" w:type="dxa"/>
+            <w:shd w:val="clear" w:color="auto" w:fill="F2F6FB"/>
+            <w:vAlign w:val="center"/>
+          </w:tcPr>
+          <w:p>
+            <w:pPr>
+              <w:keepNext/>
+              <w:spacing w:before="0" w:after="0" w:line="240" w:lineRule="auto"/>
+              <w:jc w:val="center"/>
+            </w:pPr>
+          </w:p>
+        </w:tc>
+        <w:tc>
+          <w:tcPr>
+            <w:tcW w:w="924" w:type="dxa"/>
+            <w:shd w:val="clear" w:color="auto" w:fill="F2F6FB"/>
+            <w:vAlign w:val="center"/>
+          </w:tcPr>
+          <w:p>
+            <w:pPr>
+              <w:keepNext/>
+              <w:spacing w:before="0" w:after="0" w:line="240" w:lineRule="auto"/>
+              <w:jc w:val="center"/>
+            </w:pPr>
+            <w:r>
+              <w:rPr>
+                <w:rFonts w:ascii="Calibri" w:cs="Calibri" w:eastAsia="Calibri" w:hAnsi="Calibri"/>
+                <w:color w:val="1A1A1A"/>
+                <w:sz w:val="17"/>
+                <w:szCs w:val="17"/>
+              </w:rPr>
+              <w:t xml:space="preserve">C</w:t>
+            </w:r>
+          </w:p>
+        </w:tc>
+        <w:tc>
+          <w:tcPr>
+            <w:tcW w:w="924" w:type="dxa"/>
+            <w:shd w:val="clear" w:color="auto" w:fill="F2F6FB"/>
+            <w:vAlign w:val="center"/>
+          </w:tcPr>
+          <w:p>
+            <w:pPr>
+              <w:keepNext/>
+              <w:spacing w:before="0" w:after="0" w:line="240" w:lineRule="auto"/>
+              <w:jc w:val="center"/>
+            </w:pPr>
+            <w:r>
+              <w:rPr>
+                <w:rFonts w:ascii="Calibri" w:cs="Calibri" w:eastAsia="Calibri" w:hAnsi="Calibri"/>
+                <w:color w:val="1A1A1A"/>
+                <w:sz w:val="17"/>
+                <w:szCs w:val="17"/>
+              </w:rPr>
+              <w:t xml:space="preserve">C</w:t>
+            </w:r>
+          </w:p>
+        </w:tc>
+        <w:tc>
+          <w:tcPr>
+            <w:tcW w:w="924" w:type="dxa"/>
+            <w:shd w:val="clear" w:color="auto" w:fill="F2F6FB"/>
+            <w:vAlign w:val="center"/>
+          </w:tcPr>
+          <w:p>
+            <w:pPr>
+              <w:keepNext/>
+              <w:spacing w:before="0" w:after="0" w:line="240" w:lineRule="auto"/>
+              <w:jc w:val="center"/>
+            </w:pPr>
+          </w:p>
+        </w:tc>
+        <w:tc>
+          <w:tcPr>
+            <w:tcW w:w="924" w:type="dxa"/>
+            <w:shd w:val="clear" w:color="auto" w:fill="F2F6FB"/>
+            <w:vAlign w:val="center"/>
+          </w:tcPr>
+          <w:p>
+            <w:pPr>
+              <w:keepNext/>
+              <w:spacing w:before="0" w:after="0" w:line="240" w:lineRule="auto"/>
+              <w:jc w:val="center"/>
+            </w:pPr>
+            <w:r>
+              <w:rPr>
+                <w:rFonts w:ascii="Calibri" w:cs="Calibri" w:eastAsia="Calibri" w:hAnsi="Calibri"/>
+                <w:b/>
+                <w:bCs/>
+                <w:color w:val="1F3864"/>
+                <w:sz w:val="17"/>
+                <w:szCs w:val="17"/>
+              </w:rPr>
+              <w:t xml:space="preserve">A/R</w:t>
+            </w:r>
+          </w:p>
+        </w:tc>
+        <w:tc>
+          <w:tcPr>
+            <w:tcW w:w="924" w:type="dxa"/>
+            <w:shd w:val="clear" w:color="auto" w:fill="F2F6FB"/>
+            <w:vAlign w:val="center"/>
+          </w:tcPr>
+          <w:p>
+            <w:pPr>
+              <w:keepNext/>
+              <w:spacing w:before="0" w:after="0" w:line="240" w:lineRule="auto"/>
+              <w:jc w:val="center"/>
+            </w:pPr>
+            <w:r>
+              <w:rPr>
+                <w:rFonts w:ascii="Calibri" w:cs="Calibri" w:eastAsia="Calibri" w:hAnsi="Calibri"/>
+                <w:color w:val="1A1A1A"/>
+                <w:sz w:val="17"/>
+                <w:szCs w:val="17"/>
+              </w:rPr>
+              <w:t xml:space="preserve">I</w:t>
+            </w:r>
+          </w:p>
+        </w:tc>
+        <w:tc>
+          <w:tcPr>
+            <w:tcW w:w="924" w:type="dxa"/>
+            <w:shd w:val="clear" w:color="auto" w:fill="F2F6FB"/>
+            <w:vAlign w:val="center"/>
+          </w:tcPr>
+          <w:p>
+            <w:pPr>
+              <w:keepNext/>
+              <w:spacing w:before="0" w:after="0" w:line="240" w:lineRule="auto"/>
+              <w:jc w:val="center"/>
+            </w:pPr>
+          </w:p>
+        </w:tc>
+      </w:tr>
+      <w:tr>
+        <w:trPr>
+          <w:cantSplit/>
+        </w:trPr>
+        <w:tc>
+          <w:tcPr>
+            <w:tcW w:w="2246" w:type="dxa"/>
+            <w:vAlign w:val="center"/>
+          </w:tcPr>
+          <w:p>
+            <w:pPr>
+              <w:keepNext/>
+              <w:spacing w:before="0" w:after="0" w:line="240" w:lineRule="auto"/>
+              <w:jc w:val="left"/>
+            </w:pPr>
+            <w:r>
+              <w:rPr>
+                <w:rFonts w:ascii="Calibri" w:cs="Calibri" w:eastAsia="Calibri" w:hAnsi="Calibri"/>
+                <w:b/>
+                <w:bCs/>
+                <w:color w:val="1F3864"/>
+                <w:sz w:val="17"/>
+                <w:szCs w:val="17"/>
+              </w:rPr>
+              <w:t xml:space="preserve">Contrôler la conformité RGPD et CCPA (audits, écarts)</w:t>
+            </w:r>
+          </w:p>
+        </w:tc>
+        <w:tc>
+          <w:tcPr>
+            <w:tcW w:w="924" w:type="dxa"/>
+            <w:vAlign w:val="center"/>
+          </w:tcPr>
+          <w:p>
+            <w:pPr>
+              <w:keepNext/>
+              <w:spacing w:before="0" w:after="0" w:line="240" w:lineRule="auto"/>
+              <w:jc w:val="center"/>
+            </w:pPr>
+            <w:r>
+              <w:rPr>
+                <w:rFonts w:ascii="Calibri" w:cs="Calibri" w:eastAsia="Calibri" w:hAnsi="Calibri"/>
+                <w:color w:val="1A1A1A"/>
+                <w:sz w:val="17"/>
+                <w:szCs w:val="17"/>
+              </w:rPr>
+              <w:t xml:space="preserve">I</w:t>
+            </w:r>
+          </w:p>
+        </w:tc>
+        <w:tc>
+          <w:tcPr>
+            <w:tcW w:w="924" w:type="dxa"/>
+            <w:vAlign w:val="center"/>
+          </w:tcPr>
+          <w:p>
+            <w:pPr>
+              <w:keepNext/>
+              <w:spacing w:before="0" w:after="0" w:line="240" w:lineRule="auto"/>
+              <w:jc w:val="center"/>
+            </w:pPr>
+            <w:r>
+              <w:rPr>
+                <w:rFonts w:ascii="Calibri" w:cs="Calibri" w:eastAsia="Calibri" w:hAnsi="Calibri"/>
+                <w:color w:val="1A1A1A"/>
+                <w:sz w:val="17"/>
+                <w:szCs w:val="17"/>
+              </w:rPr>
+              <w:t xml:space="preserve">I</w:t>
+            </w:r>
+          </w:p>
+        </w:tc>
+        <w:tc>
+          <w:tcPr>
+            <w:tcW w:w="924" w:type="dxa"/>
+            <w:vAlign w:val="center"/>
+          </w:tcPr>
+          <w:p>
+            <w:pPr>
+              <w:keepNext/>
+              <w:spacing w:before="0" w:after="0" w:line="240" w:lineRule="auto"/>
+              <w:jc w:val="center"/>
+            </w:pPr>
+            <w:r>
+              <w:rPr>
+                <w:rFonts w:ascii="Calibri" w:cs="Calibri" w:eastAsia="Calibri" w:hAnsi="Calibri"/>
+                <w:b/>
+                <w:bCs/>
+                <w:color w:val="1F3864"/>
+                <w:sz w:val="17"/>
+                <w:szCs w:val="17"/>
+              </w:rPr>
+              <w:t xml:space="preserve">A/R</w:t>
+            </w:r>
+          </w:p>
+        </w:tc>
+        <w:tc>
+          <w:tcPr>
+            <w:tcW w:w="924" w:type="dxa"/>
+            <w:vAlign w:val="center"/>
+          </w:tcPr>
+          <w:p>
+            <w:pPr>
+              <w:keepNext/>
+              <w:spacing w:before="0" w:after="0" w:line="240" w:lineRule="auto"/>
+              <w:jc w:val="center"/>
+            </w:pPr>
+            <w:r>
+              <w:rPr>
+                <w:rFonts w:ascii="Calibri" w:cs="Calibri" w:eastAsia="Calibri" w:hAnsi="Calibri"/>
+                <w:color w:val="1A1A1A"/>
+                <w:sz w:val="17"/>
+                <w:szCs w:val="17"/>
+              </w:rPr>
+              <w:t xml:space="preserve">C</w:t>
+            </w:r>
+          </w:p>
+        </w:tc>
+        <w:tc>
+          <w:tcPr>
+            <w:tcW w:w="924" w:type="dxa"/>
+            <w:vAlign w:val="center"/>
+          </w:tcPr>
+          <w:p>
+            <w:pPr>
+              <w:keepNext/>
+              <w:spacing w:before="0" w:after="0" w:line="240" w:lineRule="auto"/>
+              <w:jc w:val="center"/>
+            </w:pPr>
+            <w:r>
+              <w:rPr>
+                <w:rFonts w:ascii="Calibri" w:cs="Calibri" w:eastAsia="Calibri" w:hAnsi="Calibri"/>
+                <w:color w:val="1A1A1A"/>
+                <w:sz w:val="17"/>
+                <w:szCs w:val="17"/>
+              </w:rPr>
+              <w:t xml:space="preserve">C</w:t>
+            </w:r>
+          </w:p>
+        </w:tc>
+        <w:tc>
+          <w:tcPr>
+            <w:tcW w:w="924" w:type="dxa"/>
+            <w:vAlign w:val="center"/>
+          </w:tcPr>
+          <w:p>
+            <w:pPr>
+              <w:keepNext/>
+              <w:spacing w:before="0" w:after="0" w:line="240" w:lineRule="auto"/>
+              <w:jc w:val="center"/>
+            </w:pPr>
+          </w:p>
+        </w:tc>
+        <w:tc>
+          <w:tcPr>
+            <w:tcW w:w="924" w:type="dxa"/>
+            <w:vAlign w:val="center"/>
+          </w:tcPr>
+          <w:p>
+            <w:pPr>
+              <w:keepNext/>
+              <w:spacing w:before="0" w:after="0" w:line="240" w:lineRule="auto"/>
+              <w:jc w:val="center"/>
+            </w:pPr>
+            <w:r>
+              <w:rPr>
+                <w:rFonts w:ascii="Calibri" w:cs="Calibri" w:eastAsia="Calibri" w:hAnsi="Calibri"/>
+                <w:color w:val="1A1A1A"/>
+                <w:sz w:val="17"/>
+                <w:szCs w:val="17"/>
+              </w:rPr>
+              <w:t xml:space="preserve">C</w:t>
+            </w:r>
+          </w:p>
+        </w:tc>
+        <w:tc>
+          <w:tcPr>
+            <w:tcW w:w="924" w:type="dxa"/>
+            <w:vAlign w:val="center"/>
+          </w:tcPr>
+          <w:p>
+            <w:pPr>
+              <w:keepNext/>
+              <w:spacing w:before="0" w:after="0" w:line="240" w:lineRule="auto"/>
+              <w:jc w:val="center"/>
+            </w:pPr>
+          </w:p>
+        </w:tc>
+      </w:tr>
+      <w:tr>
+        <w:trPr>
+          <w:cantSplit/>
+        </w:trPr>
+        <w:tc>
+          <w:tcPr>
+            <w:tcW w:w="2246" w:type="dxa"/>
+            <w:shd w:val="clear" w:color="auto" w:fill="F2F6FB"/>
+            <w:vAlign w:val="center"/>
+          </w:tcPr>
+          <w:p>
+            <w:pPr>
+              <w:spacing w:before="0" w:after="0" w:line="240" w:lineRule="auto"/>
+              <w:jc w:val="left"/>
+            </w:pPr>
+            <w:r>
+              <w:rPr>
+                <w:rFonts w:ascii="Calibri" w:cs="Calibri" w:eastAsia="Calibri" w:hAnsi="Calibri"/>
+                <w:b/>
+                <w:bCs/>
+                <w:color w:val="1F3864"/>
+                <w:sz w:val="17"/>
+                <w:szCs w:val="17"/>
+              </w:rPr>
+              <w:t xml:space="preserve">Surveiller les biais et les données d'entraînement de l'IA</w:t>
+            </w:r>
+          </w:p>
+        </w:tc>
+        <w:tc>
+          <w:tcPr>
+            <w:tcW w:w="924" w:type="dxa"/>
+            <w:shd w:val="clear" w:color="auto" w:fill="F2F6FB"/>
+            <w:vAlign w:val="center"/>
+          </w:tcPr>
+          <w:p>
+            <w:pPr>
+              <w:spacing w:before="0" w:after="0" w:line="240" w:lineRule="auto"/>
+              <w:jc w:val="center"/>
+            </w:pPr>
+            <w:r>
+              <w:rPr>
+                <w:rFonts w:ascii="Calibri" w:cs="Calibri" w:eastAsia="Calibri" w:hAnsi="Calibri"/>
+                <w:color w:val="1A1A1A"/>
+                <w:sz w:val="17"/>
+                <w:szCs w:val="17"/>
+              </w:rPr>
+              <w:t xml:space="preserve">I</w:t>
+            </w:r>
+          </w:p>
+        </w:tc>
+        <w:tc>
+          <w:tcPr>
+            <w:tcW w:w="924" w:type="dxa"/>
+            <w:shd w:val="clear" w:color="auto" w:fill="F2F6FB"/>
+            <w:vAlign w:val="center"/>
+          </w:tcPr>
+          <w:p>
+            <w:pPr>
+              <w:spacing w:before="0" w:after="0" w:line="240" w:lineRule="auto"/>
+              <w:jc w:val="center"/>
+            </w:pPr>
+            <w:r>
+              <w:rPr>
+                <w:rFonts w:ascii="Calibri" w:cs="Calibri" w:eastAsia="Calibri" w:hAnsi="Calibri"/>
+                <w:color w:val="1A1A1A"/>
+                <w:sz w:val="17"/>
+                <w:szCs w:val="17"/>
+              </w:rPr>
+              <w:t xml:space="preserve">I</w:t>
+            </w:r>
+          </w:p>
+        </w:tc>
+        <w:tc>
+          <w:tcPr>
+            <w:tcW w:w="924" w:type="dxa"/>
+            <w:shd w:val="clear" w:color="auto" w:fill="F2F6FB"/>
+            <w:vAlign w:val="center"/>
+          </w:tcPr>
+          <w:p>
+            <w:pPr>
+              <w:spacing w:before="0" w:after="0" w:line="240" w:lineRule="auto"/>
+              <w:jc w:val="center"/>
+            </w:pPr>
+            <w:r>
+              <w:rPr>
+                <w:rFonts w:ascii="Calibri" w:cs="Calibri" w:eastAsia="Calibri" w:hAnsi="Calibri"/>
+                <w:color w:val="1A1A1A"/>
+                <w:sz w:val="17"/>
+                <w:szCs w:val="17"/>
+              </w:rPr>
+              <w:t xml:space="preserve">C</w:t>
+            </w:r>
+          </w:p>
+        </w:tc>
+        <w:tc>
+          <w:tcPr>
+            <w:tcW w:w="924" w:type="dxa"/>
+            <w:shd w:val="clear" w:color="auto" w:fill="F2F6FB"/>
+            <w:vAlign w:val="center"/>
+          </w:tcPr>
+          <w:p>
+            <w:pPr>
+              <w:spacing w:before="0" w:after="0" w:line="240" w:lineRule="auto"/>
+              <w:jc w:val="center"/>
+            </w:pPr>
+          </w:p>
+        </w:tc>
+        <w:tc>
+          <w:tcPr>
+            <w:tcW w:w="924" w:type="dxa"/>
+            <w:shd w:val="clear" w:color="auto" w:fill="F2F6FB"/>
+            <w:vAlign w:val="center"/>
+          </w:tcPr>
+          <w:p>
+            <w:pPr>
+              <w:spacing w:before="0" w:after="0" w:line="240" w:lineRule="auto"/>
+              <w:jc w:val="center"/>
+            </w:pPr>
+            <w:r>
+              <w:rPr>
+                <w:rFonts w:ascii="Calibri" w:cs="Calibri" w:eastAsia="Calibri" w:hAnsi="Calibri"/>
+                <w:color w:val="1A1A1A"/>
+                <w:sz w:val="17"/>
+                <w:szCs w:val="17"/>
+              </w:rPr>
+              <w:t xml:space="preserve">C</w:t>
+            </w:r>
+          </w:p>
+        </w:tc>
+        <w:tc>
+          <w:tcPr>
+            <w:tcW w:w="924" w:type="dxa"/>
+            <w:shd w:val="clear" w:color="auto" w:fill="F2F6FB"/>
+            <w:vAlign w:val="center"/>
+          </w:tcPr>
+          <w:p>
+            <w:pPr>
+              <w:spacing w:before="0" w:after="0" w:line="240" w:lineRule="auto"/>
+              <w:jc w:val="center"/>
+            </w:pPr>
+          </w:p>
+        </w:tc>
+        <w:tc>
+          <w:tcPr>
+            <w:tcW w:w="924" w:type="dxa"/>
+            <w:shd w:val="clear" w:color="auto" w:fill="F2F6FB"/>
+            <w:vAlign w:val="center"/>
+          </w:tcPr>
+          <w:p>
+            <w:pPr>
+              <w:spacing w:before="0" w:after="0" w:line="240" w:lineRule="auto"/>
+              <w:jc w:val="center"/>
+            </w:pPr>
+          </w:p>
+        </w:tc>
+        <w:tc>
+          <w:tcPr>
+            <w:tcW w:w="924" w:type="dxa"/>
+            <w:shd w:val="clear" w:color="auto" w:fill="F2F6FB"/>
+            <w:vAlign w:val="center"/>
+          </w:tcPr>
+          <w:p>
+            <w:pPr>
+              <w:spacing w:before="0" w:after="0" w:line="240" w:lineRule="auto"/>
+              <w:jc w:val="center"/>
+            </w:pPr>
+            <w:r>
+              <w:rPr>
+                <w:rFonts w:ascii="Calibri" w:cs="Calibri" w:eastAsia="Calibri" w:hAnsi="Calibri"/>
+                <w:b/>
+                <w:bCs/>
+                <w:color w:val="1F3864"/>
+                <w:sz w:val="17"/>
+                <w:szCs w:val="17"/>
+              </w:rPr>
+              <w:t xml:space="preserve">A/R</w:t>
+            </w:r>
+          </w:p>
+        </w:tc>
+      </w:tr>
+    </w:tbl>
+    <w:p>
+      <w:pPr>
+        <w:spacing w:before="80" w:after="40" w:line="240" w:lineRule="auto"/>
+        <w:jc w:val="center"/>
+      </w:pPr>
+      <w:r>
+        <w:rPr>
+          <w:rFonts w:ascii="Calibri" w:cs="Calibri" w:eastAsia="Calibri" w:hAnsi="Calibri"/>
+          <w:i/>
+          <w:iCs/>
+          <w:color w:val="595959"/>
+          <w:sz w:val="16"/>
+          <w:szCs w:val="16"/>
+        </w:rPr>
+        <w:t xml:space="preserve">R : réalise. A : répond du résultat et tranche, un seul par activité. C : consulté. I : informé.</w:t>
+      </w:r>
+    </w:p>
+    <w:p>
+      <w:pPr>
+        <w:spacing w:before="0" w:after="140" w:line="240" w:lineRule="auto"/>
+        <w:jc w:val="center"/>
+      </w:pPr>
+      <w:r>
+        <w:rPr>
+          <w:rFonts w:ascii="Calibri" w:cs="Calibri" w:eastAsia="Calibri" w:hAnsi="Calibri"/>
+          <w:i/>
+          <w:iCs/>
+          <w:color w:val="595959"/>
+          <w:sz w:val="16"/>
+          <w:szCs w:val="16"/>
+        </w:rPr>
+        <w:t xml:space="preserve">Matrice RACI des activités de gouvernance des données.</w:t>
       </w:r>
     </w:p>
     <w:p>

</xml_diff>

<commit_message>
Politique : droits CCPA et droit d'opposition RGPD reformulés
</commit_message>
<xml_diff>
--- a/1_Spotify_Data_Governance/versions_docx_ppt/2_Politique_Gouvernance_Donnees.docx
+++ b/1_Spotify_Data_Governance/versions_docx_ppt/2_Politique_Gouvernance_Donnees.docx
@@ -399,7 +399,7 @@
           <w:sz w:val="22"/>
           <w:szCs w:val="22"/>
         </w:rPr>
-        <w:t>Droits des utilisateurs. Chaque utilisateur peut accéder à ses données, les rectifier, les supprimer et s'opposer à leur collecte ou à leur vente.</w:t>
+        <w:t>Droits des utilisateurs. Chaque utilisateur peut accéder à ses données, les rectifier, les supprimer, s'opposer à certains traitements et refuser leur vente ou leur partage.</w:t>
       </w:r>
     </w:p>
     <w:p>
@@ -2410,7 +2410,7 @@
           <w:sz w:val="22"/>
           <w:szCs w:val="22"/>
         </w:rPr>
-        <w:t>Les traitements de Spotify respectent trois cadres. Le RGPD impose le consentement explicite, le droit d'accès, de rectification et de suppression, ainsi que la notification des violations sous 72 heures. Le CCPA garantit aux utilisateurs le droit de refuser la collecte ou la vente de leurs données. La norme PCI-DSS encadre le traitement des informations de paiement.</w:t>
+        <w:t>Les traitements de Spotify respectent trois cadres. Le RGPD impose le consentement explicite, le droit d'accès, de rectification et de suppression, ainsi que la notification des violations sous 72 heures. Le CCPA garantit aux utilisateurs le droit de connaître, de faire supprimer et de faire corriger leurs données, ainsi que celui de refuser leur vente ou leur partage. La norme PCI-DSS encadre le traitement des informations de paiement.</w:t>
       </w:r>
     </w:p>
     <w:p>

</xml_diff>